<commit_message>
Corrige a Lista de Ilustrações do .docx do TCC
O campo de Lista de Ilustrações trazia entradas de um template ABNT
genérico não relacionado ao trabalho (ex.: "Biblioteca UFFS Campus
Chapecó", "Ciclo PDCA"), nunca atualizado desde a criação do documento.

Adiciona marcadores (bookmarks) reais em cada legenda de Figura/Quadro
do documento e reconstrói o campo TOC com as 10 figuras + o Quadro 1
corretos, cada um linkado à sua legenda de verdade, com números de
página calculados a partir da paginação atual do documento. Também liga
a atualização automática de campos ao abrir o arquivo (w:updateFields),
para que o Word já recalcule tudo certo na primeira abertura.
</commit_message>
<xml_diff>
--- a/docs/TCC/Grupo_7__Fazer_correção.docx
+++ b/docs/TCC/Grupo_7__Fazer_correção.docx
@@ -395,13 +395,13 @@
         <w:instrText xml:space="preserve"> TOC \h \z \t "ABNT - Lista de ilustrações" \c </w:instrText>
         <w:fldChar w:fldCharType="separate"/>
       </w:r>
-      <w:hyperlink w:anchor="_Toc58249391" w:history="1">
+      <w:hyperlink w:anchor="_Toc192700014" w:history="1">
         <w:r>
           <w:rPr>
             <w:rStyle w:val="Hyperlink"/>
             <w:noProof/>
           </w:rPr>
-          <w:t>Figura 1 ‒ Biblioteca UFFS Campus Chapecó</w:t>
+          <w:t>Figura 1 - Tela de Login do sistema</w:t>
         </w:r>
         <w:r>
           <w:rPr>
@@ -410,7 +410,7 @@
           </w:rPr>
           <w:tab/>
           <w:fldChar w:fldCharType="begin"/>
-          <w:instrText xml:space="preserve"> PAGEREF _Toc58249391 \h </w:instrText>
+          <w:instrText xml:space="preserve"> PAGEREF _Toc192700014 \h </w:instrText>
           <w:fldChar w:fldCharType="separate"/>
           <w:t>17</w:t>
           <w:fldChar w:fldCharType="end"/>
@@ -430,13 +430,13 @@
           <w:lang w:eastAsia="pt-BR"/>
         </w:rPr>
       </w:pPr>
-      <w:hyperlink w:anchor="_Toc58249392" w:history="1">
+      <w:hyperlink w:anchor="_Toc192700015" w:history="1">
         <w:r>
           <w:rPr>
             <w:rStyle w:val="Hyperlink"/>
             <w:noProof/>
           </w:rPr>
-          <w:t>Quadro 1 ‒ Ciclo PDCA</w:t>
+          <w:t>Figura 2 - Tela de Dashboard com um dispositivo cadastrado</w:t>
         </w:r>
         <w:r>
           <w:rPr>
@@ -445,7 +445,7 @@
           </w:rPr>
           <w:tab/>
           <w:fldChar w:fldCharType="begin"/>
-          <w:instrText xml:space="preserve"> PAGEREF _Toc58249392 \h </w:instrText>
+          <w:instrText xml:space="preserve"> PAGEREF _Toc192700015 \h </w:instrText>
           <w:fldChar w:fldCharType="separate"/>
           <w:t>18</w:t>
           <w:fldChar w:fldCharType="end"/>
@@ -465,13 +465,13 @@
           <w:lang w:eastAsia="pt-BR"/>
         </w:rPr>
       </w:pPr>
-      <w:hyperlink w:anchor="_Toc58249393" w:history="1">
+      <w:hyperlink w:anchor="_Toc192700016" w:history="1">
         <w:r>
           <w:rPr>
             <w:rStyle w:val="Hyperlink"/>
             <w:noProof/>
           </w:rPr>
-          <w:t>Gráfico 1 ‒ Taxa média geométrica de crescimento anual, Brasil – 1872/2010</w:t>
+          <w:t>Figura 3 - Tela de Dashboard com múltiplos dispositivos cadastrados</w:t>
         </w:r>
         <w:r>
           <w:rPr>
@@ -480,9 +480,289 @@
           </w:rPr>
           <w:tab/>
           <w:fldChar w:fldCharType="begin"/>
-          <w:instrText xml:space="preserve"> PAGEREF _Toc58249393 \h </w:instrText>
+          <w:instrText xml:space="preserve"> PAGEREF _Toc192700016 \h </w:instrText>
           <w:fldChar w:fldCharType="separate"/>
-          <w:t>18</w:t>
+          <w:t>19</w:t>
+          <w:fldChar w:fldCharType="end"/>
+        </w:r>
+      </w:hyperlink>
+    </w:p>
+    <w:p>
+      <w:pPr>
+        <w:pStyle w:val="ndicedeilustraes"/>
+        <w:tabs>
+          <w:tab w:val="right" w:leader="dot" w:pos="9061"/>
+        </w:tabs>
+        <w:rPr>
+          <w:rFonts w:asciiTheme="minorHAnsi" w:eastAsiaTheme="minorEastAsia" w:hAnsiTheme="minorHAnsi"/>
+          <w:noProof/>
+          <w:sz w:val="22"/>
+          <w:lang w:eastAsia="pt-BR"/>
+        </w:rPr>
+      </w:pPr>
+      <w:hyperlink w:anchor="_Toc192700017" w:history="1">
+        <w:r>
+          <w:rPr>
+            <w:rStyle w:val="Hyperlink"/>
+            <w:noProof/>
+          </w:rPr>
+          <w:t>Figura 4 - Tela de Histórico de medições</w:t>
+        </w:r>
+        <w:r>
+          <w:rPr>
+            <w:noProof/>
+            <w:webHidden/>
+          </w:rPr>
+          <w:tab/>
+          <w:fldChar w:fldCharType="begin"/>
+          <w:instrText xml:space="preserve"> PAGEREF _Toc192700017 \h </w:instrText>
+          <w:fldChar w:fldCharType="separate"/>
+          <w:t>20</w:t>
+          <w:fldChar w:fldCharType="end"/>
+        </w:r>
+      </w:hyperlink>
+    </w:p>
+    <w:p>
+      <w:pPr>
+        <w:pStyle w:val="ndicedeilustraes"/>
+        <w:tabs>
+          <w:tab w:val="right" w:leader="dot" w:pos="9061"/>
+        </w:tabs>
+        <w:rPr>
+          <w:rFonts w:asciiTheme="minorHAnsi" w:eastAsiaTheme="minorEastAsia" w:hAnsiTheme="minorHAnsi"/>
+          <w:noProof/>
+          <w:sz w:val="22"/>
+          <w:lang w:eastAsia="pt-BR"/>
+        </w:rPr>
+      </w:pPr>
+      <w:hyperlink w:anchor="_Toc192700018" w:history="1">
+        <w:r>
+          <w:rPr>
+            <w:rStyle w:val="Hyperlink"/>
+            <w:noProof/>
+          </w:rPr>
+          <w:t>Figura 5 - Tela de Configurações — aba de Valores</w:t>
+        </w:r>
+        <w:r>
+          <w:rPr>
+            <w:noProof/>
+            <w:webHidden/>
+          </w:rPr>
+          <w:tab/>
+          <w:fldChar w:fldCharType="begin"/>
+          <w:instrText xml:space="preserve"> PAGEREF _Toc192700018 \h </w:instrText>
+          <w:fldChar w:fldCharType="separate"/>
+          <w:t>21</w:t>
+          <w:fldChar w:fldCharType="end"/>
+        </w:r>
+      </w:hyperlink>
+    </w:p>
+    <w:p>
+      <w:pPr>
+        <w:pStyle w:val="ndicedeilustraes"/>
+        <w:tabs>
+          <w:tab w:val="right" w:leader="dot" w:pos="9061"/>
+        </w:tabs>
+        <w:rPr>
+          <w:rFonts w:asciiTheme="minorHAnsi" w:eastAsiaTheme="minorEastAsia" w:hAnsiTheme="minorHAnsi"/>
+          <w:noProof/>
+          <w:sz w:val="22"/>
+          <w:lang w:eastAsia="pt-BR"/>
+        </w:rPr>
+      </w:pPr>
+      <w:hyperlink w:anchor="_Toc192700019" w:history="1">
+        <w:r>
+          <w:rPr>
+            <w:rStyle w:val="Hyperlink"/>
+            <w:noProof/>
+          </w:rPr>
+          <w:t>Figura 6 - Tela de Configurações — aba de Bomba d’água</w:t>
+        </w:r>
+        <w:r>
+          <w:rPr>
+            <w:noProof/>
+            <w:webHidden/>
+          </w:rPr>
+          <w:tab/>
+          <w:fldChar w:fldCharType="begin"/>
+          <w:instrText xml:space="preserve"> PAGEREF _Toc192700019 \h </w:instrText>
+          <w:fldChar w:fldCharType="separate"/>
+          <w:t>22</w:t>
+          <w:fldChar w:fldCharType="end"/>
+        </w:r>
+      </w:hyperlink>
+    </w:p>
+    <w:p>
+      <w:pPr>
+        <w:pStyle w:val="ndicedeilustraes"/>
+        <w:tabs>
+          <w:tab w:val="right" w:leader="dot" w:pos="9061"/>
+        </w:tabs>
+        <w:rPr>
+          <w:rFonts w:asciiTheme="minorHAnsi" w:eastAsiaTheme="minorEastAsia" w:hAnsiTheme="minorHAnsi"/>
+          <w:noProof/>
+          <w:sz w:val="22"/>
+          <w:lang w:eastAsia="pt-BR"/>
+        </w:rPr>
+      </w:pPr>
+      <w:hyperlink w:anchor="_Toc192700020" w:history="1">
+        <w:r>
+          <w:rPr>
+            <w:rStyle w:val="Hyperlink"/>
+            <w:noProof/>
+          </w:rPr>
+          <w:t>Figura 7 - Tela de Configurações — aba de Aparência</w:t>
+        </w:r>
+        <w:r>
+          <w:rPr>
+            <w:noProof/>
+            <w:webHidden/>
+          </w:rPr>
+          <w:tab/>
+          <w:fldChar w:fldCharType="begin"/>
+          <w:instrText xml:space="preserve"> PAGEREF _Toc192700020 \h </w:instrText>
+          <w:fldChar w:fldCharType="separate"/>
+          <w:t>23</w:t>
+          <w:fldChar w:fldCharType="end"/>
+        </w:r>
+      </w:hyperlink>
+    </w:p>
+    <w:p>
+      <w:pPr>
+        <w:pStyle w:val="ndicedeilustraes"/>
+        <w:tabs>
+          <w:tab w:val="right" w:leader="dot" w:pos="9061"/>
+        </w:tabs>
+        <w:rPr>
+          <w:rFonts w:asciiTheme="minorHAnsi" w:eastAsiaTheme="minorEastAsia" w:hAnsiTheme="minorHAnsi"/>
+          <w:noProof/>
+          <w:sz w:val="22"/>
+          <w:lang w:eastAsia="pt-BR"/>
+        </w:rPr>
+      </w:pPr>
+      <w:hyperlink w:anchor="_Toc192700021" w:history="1">
+        <w:r>
+          <w:rPr>
+            <w:rStyle w:val="Hyperlink"/>
+            <w:noProof/>
+          </w:rPr>
+          <w:t>Figura 8 - Tela de gerenciamento de Dispositivos</w:t>
+        </w:r>
+        <w:r>
+          <w:rPr>
+            <w:noProof/>
+            <w:webHidden/>
+          </w:rPr>
+          <w:tab/>
+          <w:fldChar w:fldCharType="begin"/>
+          <w:instrText xml:space="preserve"> PAGEREF _Toc192700021 \h </w:instrText>
+          <w:fldChar w:fldCharType="separate"/>
+          <w:t>24</w:t>
+          <w:fldChar w:fldCharType="end"/>
+        </w:r>
+      </w:hyperlink>
+    </w:p>
+    <w:p>
+      <w:pPr>
+        <w:pStyle w:val="ndicedeilustraes"/>
+        <w:tabs>
+          <w:tab w:val="right" w:leader="dot" w:pos="9061"/>
+        </w:tabs>
+        <w:rPr>
+          <w:rFonts w:asciiTheme="minorHAnsi" w:eastAsiaTheme="minorEastAsia" w:hAnsiTheme="minorHAnsi"/>
+          <w:noProof/>
+          <w:sz w:val="22"/>
+          <w:lang w:eastAsia="pt-BR"/>
+        </w:rPr>
+      </w:pPr>
+      <w:hyperlink w:anchor="_Toc192700022" w:history="1">
+        <w:r>
+          <w:rPr>
+            <w:rStyle w:val="Hyperlink"/>
+            <w:noProof/>
+          </w:rPr>
+          <w:t>Figura 9 - Tela de Notificações com mais de um dispositivo</w:t>
+        </w:r>
+        <w:r>
+          <w:rPr>
+            <w:noProof/>
+            <w:webHidden/>
+          </w:rPr>
+          <w:tab/>
+          <w:fldChar w:fldCharType="begin"/>
+          <w:instrText xml:space="preserve"> PAGEREF _Toc192700022 \h </w:instrText>
+          <w:fldChar w:fldCharType="separate"/>
+          <w:t>25</w:t>
+          <w:fldChar w:fldCharType="end"/>
+        </w:r>
+      </w:hyperlink>
+    </w:p>
+    <w:p>
+      <w:pPr>
+        <w:pStyle w:val="ndicedeilustraes"/>
+        <w:tabs>
+          <w:tab w:val="right" w:leader="dot" w:pos="9061"/>
+        </w:tabs>
+        <w:rPr>
+          <w:rFonts w:asciiTheme="minorHAnsi" w:eastAsiaTheme="minorEastAsia" w:hAnsiTheme="minorHAnsi"/>
+          <w:noProof/>
+          <w:sz w:val="22"/>
+          <w:lang w:eastAsia="pt-BR"/>
+        </w:rPr>
+      </w:pPr>
+      <w:hyperlink w:anchor="_Toc192700023" w:history="1">
+        <w:r>
+          <w:rPr>
+            <w:rStyle w:val="Hyperlink"/>
+            <w:noProof/>
+          </w:rPr>
+          <w:t>Figura 10 - Tela de Perfil do usuário</w:t>
+        </w:r>
+        <w:r>
+          <w:rPr>
+            <w:noProof/>
+            <w:webHidden/>
+          </w:rPr>
+          <w:tab/>
+          <w:fldChar w:fldCharType="begin"/>
+          <w:instrText xml:space="preserve"> PAGEREF _Toc192700023 \h </w:instrText>
+          <w:fldChar w:fldCharType="separate"/>
+          <w:t>26</w:t>
+          <w:fldChar w:fldCharType="end"/>
+        </w:r>
+      </w:hyperlink>
+    </w:p>
+    <w:p>
+      <w:pPr>
+        <w:pStyle w:val="ndicedeilustraes"/>
+        <w:tabs>
+          <w:tab w:val="right" w:leader="dot" w:pos="9061"/>
+        </w:tabs>
+        <w:rPr>
+          <w:rFonts w:asciiTheme="minorHAnsi" w:eastAsiaTheme="minorEastAsia" w:hAnsiTheme="minorHAnsi"/>
+          <w:noProof/>
+          <w:sz w:val="22"/>
+          <w:lang w:eastAsia="pt-BR"/>
+        </w:rPr>
+      </w:pPr>
+      <w:hyperlink w:anchor="_Toc192700024" w:history="1">
+        <w:r>
+          <w:rPr>
+            <w:rStyle w:val="Hyperlink"/>
+            <w:noProof/>
+          </w:rPr>
+          <w:t>Quadro 1 - Documentos técnicos complementares</w:t>
+        </w:r>
+        <w:r>
+          <w:rPr>
+            <w:noProof/>
+            <w:webHidden/>
+          </w:rPr>
+          <w:tab/>
+          <w:fldChar w:fldCharType="begin"/>
+          <w:instrText xml:space="preserve"> PAGEREF _Toc192700024 \h </w:instrText>
+          <w:fldChar w:fldCharType="separate"/>
+          <w:t>31</w:t>
           <w:fldChar w:fldCharType="end"/>
         </w:r>
       </w:hyperlink>
@@ -2361,6 +2641,7 @@
           <w:rFonts w:ascii="Arial" w:hAnsi="Arial" w:cs="Arial"/>
         </w:rPr>
       </w:pPr>
+      <w:bookmarkStart w:id="14" w:name="_Toc192700014"/>
       <w:r>
         <w:t xml:space="preserve">Figura </w:t>
         <w:fldChar w:fldCharType="begin"/>
@@ -2377,6 +2658,7 @@
         <w:fldChar w:fldCharType="end"/>
         <w:t xml:space="preserve"> - Tela de Login do sistema</w:t>
       </w:r>
+      <w:bookmarkEnd w:id="14"/>
     </w:p>
     <w:p>
       <w:pPr>
@@ -2461,6 +2743,7 @@
           <w:rFonts w:ascii="Arial" w:hAnsi="Arial" w:cs="Arial"/>
         </w:rPr>
       </w:pPr>
+      <w:bookmarkStart w:id="15" w:name="_Toc192700015"/>
       <w:r>
         <w:t xml:space="preserve">Figura </w:t>
         <w:fldChar w:fldCharType="begin"/>
@@ -2477,6 +2760,7 @@
         <w:fldChar w:fldCharType="end"/>
         <w:t xml:space="preserve"> - Tela de Dashboard com um dispositivo cadastrado</w:t>
       </w:r>
+      <w:bookmarkEnd w:id="15"/>
     </w:p>
     <w:p>
       <w:pPr>
@@ -2561,6 +2845,7 @@
           <w:rFonts w:ascii="Arial" w:hAnsi="Arial" w:cs="Arial"/>
         </w:rPr>
       </w:pPr>
+      <w:bookmarkStart w:id="16" w:name="_Toc192700016"/>
       <w:r>
         <w:t xml:space="preserve">Figura </w:t>
         <w:fldChar w:fldCharType="begin"/>
@@ -2577,6 +2862,7 @@
         <w:fldChar w:fldCharType="end"/>
         <w:t xml:space="preserve"> - Tela de Dashboard com múltiplos dispositivos cadastrados</w:t>
       </w:r>
+      <w:bookmarkEnd w:id="16"/>
     </w:p>
     <w:p>
       <w:pPr>
@@ -2661,6 +2947,7 @@
           <w:rFonts w:ascii="Arial" w:hAnsi="Arial" w:cs="Arial"/>
         </w:rPr>
       </w:pPr>
+      <w:bookmarkStart w:id="17" w:name="_Toc192700017"/>
       <w:r>
         <w:t xml:space="preserve">Figura </w:t>
         <w:fldChar w:fldCharType="begin"/>
@@ -2677,6 +2964,7 @@
         <w:fldChar w:fldCharType="end"/>
         <w:t xml:space="preserve"> - Tela de Histórico de medições</w:t>
       </w:r>
+      <w:bookmarkEnd w:id="17"/>
     </w:p>
     <w:p>
       <w:pPr>
@@ -2761,6 +3049,7 @@
           <w:rFonts w:ascii="Arial" w:hAnsi="Arial" w:cs="Arial"/>
         </w:rPr>
       </w:pPr>
+      <w:bookmarkStart w:id="18" w:name="_Toc192700018"/>
       <w:r>
         <w:t xml:space="preserve">Figura </w:t>
         <w:fldChar w:fldCharType="begin"/>
@@ -2777,6 +3066,7 @@
         <w:fldChar w:fldCharType="end"/>
         <w:t xml:space="preserve"> - Tela de Configurações — aba de Valores</w:t>
       </w:r>
+      <w:bookmarkEnd w:id="18"/>
     </w:p>
     <w:p>
       <w:pPr>
@@ -2861,6 +3151,7 @@
           <w:rFonts w:ascii="Arial" w:hAnsi="Arial" w:cs="Arial"/>
         </w:rPr>
       </w:pPr>
+      <w:bookmarkStart w:id="19" w:name="_Toc192700019"/>
       <w:r>
         <w:t xml:space="preserve">Figura </w:t>
         <w:fldChar w:fldCharType="begin"/>
@@ -2877,6 +3168,7 @@
         <w:fldChar w:fldCharType="end"/>
         <w:t xml:space="preserve"> - Tela de Configurações — aba de Bomba d’água</w:t>
       </w:r>
+      <w:bookmarkEnd w:id="19"/>
     </w:p>
     <w:p>
       <w:pPr>
@@ -2961,6 +3253,7 @@
           <w:rFonts w:ascii="Arial" w:hAnsi="Arial" w:cs="Arial"/>
         </w:rPr>
       </w:pPr>
+      <w:bookmarkStart w:id="20" w:name="_Toc192700020"/>
       <w:r>
         <w:t xml:space="preserve">Figura </w:t>
         <w:fldChar w:fldCharType="begin"/>
@@ -2977,6 +3270,7 @@
         <w:fldChar w:fldCharType="end"/>
         <w:t xml:space="preserve"> - Tela de Configurações — aba de Aparência</w:t>
       </w:r>
+      <w:bookmarkEnd w:id="20"/>
     </w:p>
     <w:p>
       <w:pPr>
@@ -3061,6 +3355,7 @@
           <w:rFonts w:ascii="Arial" w:hAnsi="Arial" w:cs="Arial"/>
         </w:rPr>
       </w:pPr>
+      <w:bookmarkStart w:id="21" w:name="_Toc192700021"/>
       <w:r>
         <w:t xml:space="preserve">Figura </w:t>
         <w:fldChar w:fldCharType="begin"/>
@@ -3077,6 +3372,7 @@
         <w:fldChar w:fldCharType="end"/>
         <w:t xml:space="preserve"> - Tela de gerenciamento de Dispositivos</w:t>
       </w:r>
+      <w:bookmarkEnd w:id="21"/>
     </w:p>
     <w:p>
       <w:pPr>
@@ -3161,6 +3457,7 @@
           <w:rFonts w:ascii="Arial" w:hAnsi="Arial" w:cs="Arial"/>
         </w:rPr>
       </w:pPr>
+      <w:bookmarkStart w:id="22" w:name="_Toc192700022"/>
       <w:r>
         <w:t xml:space="preserve">Figura </w:t>
         <w:fldChar w:fldCharType="begin"/>
@@ -3177,6 +3474,7 @@
         <w:fldChar w:fldCharType="end"/>
         <w:t xml:space="preserve"> - Tela de Notificações com mais de um dispositivo</w:t>
       </w:r>
+      <w:bookmarkEnd w:id="22"/>
     </w:p>
     <w:p>
       <w:pPr>
@@ -3261,6 +3559,7 @@
           <w:rFonts w:ascii="Arial" w:hAnsi="Arial" w:cs="Arial"/>
         </w:rPr>
       </w:pPr>
+      <w:bookmarkStart w:id="23" w:name="_Toc192700023"/>
       <w:r>
         <w:t xml:space="preserve">Figura </w:t>
         <w:fldChar w:fldCharType="begin"/>
@@ -3277,6 +3576,7 @@
         <w:fldChar w:fldCharType="end"/>
         <w:t xml:space="preserve"> - Tela de Perfil do usuário</w:t>
       </w:r>
+      <w:bookmarkEnd w:id="23"/>
     </w:p>
     <w:p>
       <w:pPr>
@@ -4384,6 +4684,7 @@
           <w:highlight w:val="yellow"/>
         </w:rPr>
       </w:pPr>
+      <w:bookmarkStart w:id="24" w:name="_Toc192700024"/>
       <w:r>
         <w:rPr>
           <w:rFonts w:ascii="Arial" w:hAnsi="Arial" w:cs="Arial"/>
@@ -4391,6 +4692,7 @@
         </w:rPr>
         <w:t>Quadro 1 – Documentos técnicos complementares</w:t>
       </w:r>
+      <w:bookmarkEnd w:id="24"/>
     </w:p>
     <w:tbl>
       <w:tblPr>

</xml_diff>

<commit_message>
Documenta docs/Teste/ no Apêndice B do TCC (Quadro 2)
Segue o mesmo padrão já usado para os onze documentos técnicos de
docs/documentacao/: acrescenta um parágrafo explicando o propósito da
pasta docs/Teste/ (anotações pessoais de teste e cópias de trabalho dos
guias, fora do padrão de revisão dos documentos numerados) e um novo
Quadro 2 relacionando cada um dos 4 arquivos da pasta. Atualiza também a
Lista de Ilustrações com a nova entrada e o número de página correto.
</commit_message>
<xml_diff>
--- a/docs/TCC/Grupo_7__Fazer_correção.docx
+++ b/docs/TCC/Grupo_7__Fazer_correção.docx
@@ -763,6 +763,41 @@
           <w:instrText xml:space="preserve"> PAGEREF _Toc192700024 \h </w:instrText>
           <w:fldChar w:fldCharType="separate"/>
           <w:t>31</w:t>
+          <w:fldChar w:fldCharType="end"/>
+        </w:r>
+      </w:hyperlink>
+    </w:p>
+    <w:p>
+      <w:pPr>
+        <w:pStyle w:val="ndicedeilustraes"/>
+        <w:tabs>
+          <w:tab w:val="right" w:leader="dot" w:pos="9061"/>
+        </w:tabs>
+        <w:rPr>
+          <w:rFonts w:asciiTheme="minorHAnsi" w:eastAsiaTheme="minorEastAsia" w:hAnsiTheme="minorHAnsi"/>
+          <w:noProof/>
+          <w:sz w:val="22"/>
+          <w:lang w:eastAsia="pt-BR"/>
+        </w:rPr>
+      </w:pPr>
+      <w:hyperlink w:anchor="_Toc192700025" w:history="1">
+        <w:r>
+          <w:rPr>
+            <w:rStyle w:val="Hyperlink"/>
+            <w:noProof/>
+          </w:rPr>
+          <w:t>Quadro 2 - Anotações de teste complementares (docs/Teste/)</w:t>
+        </w:r>
+        <w:r>
+          <w:rPr>
+            <w:noProof/>
+            <w:webHidden/>
+          </w:rPr>
+          <w:tab/>
+          <w:fldChar w:fldCharType="begin"/>
+          <w:instrText xml:space="preserve"> PAGEREF _Toc192700025 \h </w:instrText>
+          <w:fldChar w:fldCharType="separate"/>
+          <w:t>32</w:t>
           <w:fldChar w:fldCharType="end"/>
         </w:r>
       </w:hyperlink>
@@ -5414,6 +5449,364 @@
                 <w:highlight w:val="yellow"/>
               </w:rPr>
               <w:t>Versão condensada do documento anterior, com uma linha por arquivo, para consulta rápida durante a apresentação.</w:t>
+            </w:r>
+          </w:p>
+        </w:tc>
+      </w:tr>
+    </w:tbl>
+    <w:p>
+      <w:pPr>
+        <w:spacing w:line="360" w:lineRule="auto"/>
+        <w:ind w:firstLine="709"/>
+        <w:jc w:val="both"/>
+        <w:rPr>
+          <w:rFonts w:ascii="Arial" w:hAnsi="Arial" w:cs="Arial"/>
+          <w:highlight w:val="yellow"/>
+        </w:rPr>
+      </w:pPr>
+      <w:r>
+        <w:rPr>
+          <w:rFonts w:ascii="Arial" w:hAnsi="Arial" w:cs="Arial"/>
+          <w:highlight w:val="yellow"/>
+        </w:rPr>
+        <w:t xml:space="preserve">Além dos onze documentos técnicos, o diretório docs/Teste/ reúne anotações pessoais de teste tomadas ao longo do desenvolvimento — cópias de trabalho dos guias de instalação e de teste com o ESP32 real, usadas durante as sessões práticas com a turma, e registros informais de fiação e comandos de terminal. Por não seguirem o mesmo padrão de revisão dos documentos numerados, ficam guardadas à parte, fora da pasta docs/documentacao/. O Quadro 2 relaciona o conteúdo de cada arquivo.</w:t>
+      </w:r>
+    </w:p>
+    <w:p>
+      <w:pPr>
+        <w:spacing w:after="80" w:line="360" w:lineRule="auto"/>
+        <w:jc w:val="center"/>
+        <w:rPr>
+          <w:rFonts w:ascii="Arial" w:hAnsi="Arial" w:cs="Arial"/>
+          <w:highlight w:val="yellow"/>
+        </w:rPr>
+      </w:pPr>
+      <w:bookmarkStart w:id="25" w:name="_Toc192700025"/>
+      <w:r>
+        <w:rPr>
+          <w:rFonts w:ascii="Arial" w:hAnsi="Arial" w:cs="Arial"/>
+          <w:highlight w:val="yellow"/>
+        </w:rPr>
+        <w:t>Quadro 2 – Anotações de teste complementares (docs/Teste/)</w:t>
+      </w:r>
+      <w:bookmarkEnd w:id="25"/>
+    </w:p>
+    <w:tbl>
+      <w:tblPr>
+        <w:tblW w:w="9000" w:type="dxa"/>
+        <w:tblBorders>
+          <w:top w:val="single" w:sz="4" w:space="0" w:color="auto"/>
+          <w:left w:val="single" w:sz="4" w:space="0" w:color="auto"/>
+          <w:bottom w:val="single" w:sz="4" w:space="0" w:color="auto"/>
+          <w:right w:val="single" w:sz="4" w:space="0" w:color="auto"/>
+          <w:insideH w:val="single" w:sz="4" w:space="0" w:color="auto"/>
+          <w:insideV w:val="single" w:sz="4" w:space="0" w:color="auto"/>
+        </w:tblBorders>
+        <w:tblCellMar>
+          <w:left w:w="10" w:type="dxa"/>
+          <w:right w:w="10" w:type="dxa"/>
+        </w:tblCellMar>
+        <w:tblLook w:val="04A0" w:firstRow="1" w:lastRow="0" w:firstColumn="1" w:lastColumn="0" w:noHBand="0" w:noVBand="1"/>
+      </w:tblPr>
+      <w:tblGrid>
+        <w:gridCol w:w="3200"/>
+        <w:gridCol w:w="5800"/>
+      </w:tblGrid>
+      <w:tr>
+        <w:trPr>
+          <w:tblHeader/>
+        </w:trPr>
+        <w:tc>
+          <w:tcPr>
+            <w:tcW w:w="3200" w:type="dxa"/>
+            <w:shd w:val="clear" w:color="auto" w:fill="D9D9D9"/>
+            <w:tcMar>
+              <w:top w:w="80" w:type="dxa"/>
+              <w:left w:w="100" w:type="dxa"/>
+              <w:bottom w:w="80" w:type="dxa"/>
+              <w:right w:w="100" w:type="dxa"/>
+            </w:tcMar>
+          </w:tcPr>
+          <w:p>
+            <w:pPr>
+              <w:rPr>
+                <w:rFonts w:ascii="Arial" w:hAnsi="Arial" w:cs="Arial"/>
+                <w:highlight w:val="yellow"/>
+              </w:rPr>
+            </w:pPr>
+            <w:r>
+              <w:rPr>
+                <w:rFonts w:ascii="Arial" w:hAnsi="Arial" w:cs="Arial"/>
+                <w:b/>
+                <w:bCs/>
+                <w:sz w:val="20"/>
+                <w:szCs w:val="20"/>
+                <w:highlight w:val="yellow"/>
+              </w:rPr>
+              <w:t>Arquivo</w:t>
+            </w:r>
+          </w:p>
+        </w:tc>
+        <w:tc>
+          <w:tcPr>
+            <w:tcW w:w="5800" w:type="dxa"/>
+            <w:shd w:val="clear" w:color="auto" w:fill="D9D9D9"/>
+            <w:tcMar>
+              <w:top w:w="80" w:type="dxa"/>
+              <w:left w:w="100" w:type="dxa"/>
+              <w:bottom w:w="80" w:type="dxa"/>
+              <w:right w:w="100" w:type="dxa"/>
+            </w:tcMar>
+          </w:tcPr>
+          <w:p>
+            <w:pPr>
+              <w:rPr>
+                <w:rFonts w:ascii="Arial" w:hAnsi="Arial" w:cs="Arial"/>
+                <w:highlight w:val="yellow"/>
+              </w:rPr>
+            </w:pPr>
+            <w:r>
+              <w:rPr>
+                <w:rFonts w:ascii="Arial" w:hAnsi="Arial" w:cs="Arial"/>
+                <w:b/>
+                <w:bCs/>
+                <w:sz w:val="20"/>
+                <w:szCs w:val="20"/>
+                <w:highlight w:val="yellow"/>
+              </w:rPr>
+              <w:t>Conteúdo</w:t>
+            </w:r>
+          </w:p>
+        </w:tc>
+      </w:tr>
+      <w:tr>
+        <w:tc>
+          <w:tcPr>
+            <w:tcW w:w="3200" w:type="dxa"/>
+            <w:tcMar>
+              <w:top w:w="80" w:type="dxa"/>
+              <w:left w:w="100" w:type="dxa"/>
+              <w:bottom w:w="80" w:type="dxa"/>
+              <w:right w:w="100" w:type="dxa"/>
+            </w:tcMar>
+          </w:tcPr>
+          <w:p>
+            <w:pPr>
+              <w:rPr>
+                <w:rFonts w:ascii="Arial" w:hAnsi="Arial" w:cs="Arial"/>
+                <w:highlight w:val="yellow"/>
+              </w:rPr>
+            </w:pPr>
+            <w:r>
+              <w:rPr>
+                <w:rFonts w:ascii="Arial" w:eastAsia="Courier New" w:hAnsi="Arial" w:cs="Arial"/>
+                <w:sz w:val="18"/>
+                <w:szCs w:val="18"/>
+                <w:highlight w:val="yellow"/>
+              </w:rPr>
+              <w:t>05-guia-teste-iniciante.txt</w:t>
+            </w:r>
+          </w:p>
+        </w:tc>
+        <w:tc>
+          <w:tcPr>
+            <w:tcW w:w="5800" w:type="dxa"/>
+            <w:tcMar>
+              <w:top w:w="80" w:type="dxa"/>
+              <w:left w:w="100" w:type="dxa"/>
+              <w:bottom w:w="80" w:type="dxa"/>
+              <w:right w:w="100" w:type="dxa"/>
+            </w:tcMar>
+          </w:tcPr>
+          <w:p>
+            <w:pPr>
+              <w:rPr>
+                <w:rFonts w:ascii="Arial" w:hAnsi="Arial" w:cs="Arial"/>
+                <w:highlight w:val="yellow"/>
+              </w:rPr>
+            </w:pPr>
+            <w:r>
+              <w:rPr>
+                <w:rFonts w:ascii="Arial" w:hAnsi="Arial" w:cs="Arial"/>
+                <w:sz w:val="20"/>
+                <w:szCs w:val="20"/>
+                <w:highlight w:val="yellow"/>
+              </w:rPr>
+              <w:t>Cópia de trabalho do guia de instalação do ambiente de desenvolvimento (mesmo conteúdo do documento 05, em docs/documentacao/).</w:t>
+            </w:r>
+          </w:p>
+        </w:tc>
+      </w:tr>
+      <w:tr>
+        <w:tc>
+          <w:tcPr>
+            <w:tcW w:w="3200" w:type="dxa"/>
+            <w:tcMar>
+              <w:top w:w="80" w:type="dxa"/>
+              <w:left w:w="100" w:type="dxa"/>
+              <w:bottom w:w="80" w:type="dxa"/>
+              <w:right w:w="100" w:type="dxa"/>
+            </w:tcMar>
+          </w:tcPr>
+          <w:p>
+            <w:pPr>
+              <w:rPr>
+                <w:rFonts w:ascii="Arial" w:hAnsi="Arial" w:cs="Arial"/>
+                <w:highlight w:val="yellow"/>
+              </w:rPr>
+            </w:pPr>
+            <w:r>
+              <w:rPr>
+                <w:rFonts w:ascii="Arial" w:eastAsia="Courier New" w:hAnsi="Arial" w:cs="Arial"/>
+                <w:sz w:val="18"/>
+                <w:szCs w:val="18"/>
+                <w:highlight w:val="yellow"/>
+              </w:rPr>
+              <w:t>06-guia-teste-arduino-real.txt</w:t>
+            </w:r>
+          </w:p>
+        </w:tc>
+        <w:tc>
+          <w:tcPr>
+            <w:tcW w:w="5800" w:type="dxa"/>
+            <w:tcMar>
+              <w:top w:w="80" w:type="dxa"/>
+              <w:left w:w="100" w:type="dxa"/>
+              <w:bottom w:w="80" w:type="dxa"/>
+              <w:right w:w="100" w:type="dxa"/>
+            </w:tcMar>
+          </w:tcPr>
+          <w:p>
+            <w:pPr>
+              <w:rPr>
+                <w:rFonts w:ascii="Arial" w:hAnsi="Arial" w:cs="Arial"/>
+                <w:highlight w:val="yellow"/>
+              </w:rPr>
+            </w:pPr>
+            <w:r>
+              <w:rPr>
+                <w:rFonts w:ascii="Arial" w:hAnsi="Arial" w:cs="Arial"/>
+                <w:sz w:val="20"/>
+                <w:szCs w:val="20"/>
+                <w:highlight w:val="yellow"/>
+              </w:rPr>
+              <w:t>Cópia de trabalho do guia de teste com um ESP32 físico e sensor DHT11 (mesmo conteúdo do documento 06).</w:t>
+            </w:r>
+          </w:p>
+        </w:tc>
+      </w:tr>
+      <w:tr>
+        <w:tc>
+          <w:tcPr>
+            <w:tcW w:w="3200" w:type="dxa"/>
+            <w:tcMar>
+              <w:top w:w="80" w:type="dxa"/>
+              <w:left w:w="100" w:type="dxa"/>
+              <w:bottom w:w="80" w:type="dxa"/>
+              <w:right w:w="100" w:type="dxa"/>
+            </w:tcMar>
+          </w:tcPr>
+          <w:p>
+            <w:pPr>
+              <w:rPr>
+                <w:rFonts w:ascii="Arial" w:hAnsi="Arial" w:cs="Arial"/>
+                <w:highlight w:val="yellow"/>
+              </w:rPr>
+            </w:pPr>
+            <w:r>
+              <w:rPr>
+                <w:rFonts w:ascii="Arial" w:eastAsia="Courier New" w:hAnsi="Arial" w:cs="Arial"/>
+                <w:sz w:val="18"/>
+                <w:szCs w:val="18"/>
+                <w:highlight w:val="yellow"/>
+              </w:rPr>
+              <w:t>Tutorial ESP.txt</w:t>
+            </w:r>
+          </w:p>
+        </w:tc>
+        <w:tc>
+          <w:tcPr>
+            <w:tcW w:w="5800" w:type="dxa"/>
+            <w:tcMar>
+              <w:top w:w="80" w:type="dxa"/>
+              <w:left w:w="100" w:type="dxa"/>
+              <w:bottom w:w="80" w:type="dxa"/>
+              <w:right w:w="100" w:type="dxa"/>
+            </w:tcMar>
+          </w:tcPr>
+          <w:p>
+            <w:pPr>
+              <w:rPr>
+                <w:rFonts w:ascii="Arial" w:hAnsi="Arial" w:cs="Arial"/>
+                <w:highlight w:val="yellow"/>
+              </w:rPr>
+            </w:pPr>
+            <w:r>
+              <w:rPr>
+                <w:rFonts w:ascii="Arial" w:hAnsi="Arial" w:cs="Arial"/>
+                <w:sz w:val="20"/>
+                <w:szCs w:val="20"/>
+                <w:highlight w:val="yellow"/>
+              </w:rPr>
+              <w:t>Anotações rápidas de fiação do DHT11 ao ESP32, tomadas durante a montagem física do protótipo.</w:t>
+            </w:r>
+          </w:p>
+        </w:tc>
+      </w:tr>
+      <w:tr>
+        <w:tc>
+          <w:tcPr>
+            <w:tcW w:w="3200" w:type="dxa"/>
+            <w:tcMar>
+              <w:top w:w="80" w:type="dxa"/>
+              <w:left w:w="100" w:type="dxa"/>
+              <w:bottom w:w="80" w:type="dxa"/>
+              <w:right w:w="100" w:type="dxa"/>
+            </w:tcMar>
+          </w:tcPr>
+          <w:p>
+            <w:pPr>
+              <w:rPr>
+                <w:rFonts w:ascii="Arial" w:hAnsi="Arial" w:cs="Arial"/>
+                <w:highlight w:val="yellow"/>
+              </w:rPr>
+            </w:pPr>
+            <w:r>
+              <w:rPr>
+                <w:rFonts w:ascii="Arial" w:eastAsia="Courier New" w:hAnsi="Arial" w:cs="Arial"/>
+                <w:sz w:val="18"/>
+                <w:szCs w:val="18"/>
+                <w:highlight w:val="yellow"/>
+              </w:rPr>
+              <w:t>Tutorial escola.txt</w:t>
+            </w:r>
+          </w:p>
+        </w:tc>
+        <w:tc>
+          <w:tcPr>
+            <w:tcW w:w="5800" w:type="dxa"/>
+            <w:tcMar>
+              <w:top w:w="80" w:type="dxa"/>
+              <w:left w:w="100" w:type="dxa"/>
+              <w:bottom w:w="80" w:type="dxa"/>
+              <w:right w:w="100" w:type="dxa"/>
+            </w:tcMar>
+          </w:tcPr>
+          <w:p>
+            <w:pPr>
+              <w:rPr>
+                <w:rFonts w:ascii="Arial" w:hAnsi="Arial" w:cs="Arial"/>
+                <w:highlight w:val="yellow"/>
+              </w:rPr>
+            </w:pPr>
+            <w:r>
+              <w:rPr>
+                <w:rFonts w:ascii="Arial" w:hAnsi="Arial" w:cs="Arial"/>
+                <w:sz w:val="20"/>
+                <w:szCs w:val="20"/>
+                <w:highlight w:val="yellow"/>
+              </w:rPr>
+              <w:t>Comandos de terminal (PowerShell, psql) anotados durante as sessões práticas de teste na escola.</w:t>
             </w:r>
           </w:p>
         </w:tc>

</xml_diff>

<commit_message>
Revert "Documenta docs/Teste/ no Apêndice B do TCC (Quadro 2)"
This reverts commit 916e0382bddcd7f21c979bf1a024a3d1d72cdf88.
</commit_message>
<xml_diff>
--- a/docs/TCC/Grupo_7__Fazer_correção.docx
+++ b/docs/TCC/Grupo_7__Fazer_correção.docx
@@ -763,41 +763,6 @@
           <w:instrText xml:space="preserve"> PAGEREF _Toc192700024 \h </w:instrText>
           <w:fldChar w:fldCharType="separate"/>
           <w:t>31</w:t>
-          <w:fldChar w:fldCharType="end"/>
-        </w:r>
-      </w:hyperlink>
-    </w:p>
-    <w:p>
-      <w:pPr>
-        <w:pStyle w:val="ndicedeilustraes"/>
-        <w:tabs>
-          <w:tab w:val="right" w:leader="dot" w:pos="9061"/>
-        </w:tabs>
-        <w:rPr>
-          <w:rFonts w:asciiTheme="minorHAnsi" w:eastAsiaTheme="minorEastAsia" w:hAnsiTheme="minorHAnsi"/>
-          <w:noProof/>
-          <w:sz w:val="22"/>
-          <w:lang w:eastAsia="pt-BR"/>
-        </w:rPr>
-      </w:pPr>
-      <w:hyperlink w:anchor="_Toc192700025" w:history="1">
-        <w:r>
-          <w:rPr>
-            <w:rStyle w:val="Hyperlink"/>
-            <w:noProof/>
-          </w:rPr>
-          <w:t>Quadro 2 - Anotações de teste complementares (docs/Teste/)</w:t>
-        </w:r>
-        <w:r>
-          <w:rPr>
-            <w:noProof/>
-            <w:webHidden/>
-          </w:rPr>
-          <w:tab/>
-          <w:fldChar w:fldCharType="begin"/>
-          <w:instrText xml:space="preserve"> PAGEREF _Toc192700025 \h </w:instrText>
-          <w:fldChar w:fldCharType="separate"/>
-          <w:t>32</w:t>
           <w:fldChar w:fldCharType="end"/>
         </w:r>
       </w:hyperlink>
@@ -5449,364 +5414,6 @@
                 <w:highlight w:val="yellow"/>
               </w:rPr>
               <w:t>Versão condensada do documento anterior, com uma linha por arquivo, para consulta rápida durante a apresentação.</w:t>
-            </w:r>
-          </w:p>
-        </w:tc>
-      </w:tr>
-    </w:tbl>
-    <w:p>
-      <w:pPr>
-        <w:spacing w:line="360" w:lineRule="auto"/>
-        <w:ind w:firstLine="709"/>
-        <w:jc w:val="both"/>
-        <w:rPr>
-          <w:rFonts w:ascii="Arial" w:hAnsi="Arial" w:cs="Arial"/>
-          <w:highlight w:val="yellow"/>
-        </w:rPr>
-      </w:pPr>
-      <w:r>
-        <w:rPr>
-          <w:rFonts w:ascii="Arial" w:hAnsi="Arial" w:cs="Arial"/>
-          <w:highlight w:val="yellow"/>
-        </w:rPr>
-        <w:t xml:space="preserve">Além dos onze documentos técnicos, o diretório docs/Teste/ reúne anotações pessoais de teste tomadas ao longo do desenvolvimento — cópias de trabalho dos guias de instalação e de teste com o ESP32 real, usadas durante as sessões práticas com a turma, e registros informais de fiação e comandos de terminal. Por não seguirem o mesmo padrão de revisão dos documentos numerados, ficam guardadas à parte, fora da pasta docs/documentacao/. O Quadro 2 relaciona o conteúdo de cada arquivo.</w:t>
-      </w:r>
-    </w:p>
-    <w:p>
-      <w:pPr>
-        <w:spacing w:after="80" w:line="360" w:lineRule="auto"/>
-        <w:jc w:val="center"/>
-        <w:rPr>
-          <w:rFonts w:ascii="Arial" w:hAnsi="Arial" w:cs="Arial"/>
-          <w:highlight w:val="yellow"/>
-        </w:rPr>
-      </w:pPr>
-      <w:bookmarkStart w:id="25" w:name="_Toc192700025"/>
-      <w:r>
-        <w:rPr>
-          <w:rFonts w:ascii="Arial" w:hAnsi="Arial" w:cs="Arial"/>
-          <w:highlight w:val="yellow"/>
-        </w:rPr>
-        <w:t>Quadro 2 – Anotações de teste complementares (docs/Teste/)</w:t>
-      </w:r>
-      <w:bookmarkEnd w:id="25"/>
-    </w:p>
-    <w:tbl>
-      <w:tblPr>
-        <w:tblW w:w="9000" w:type="dxa"/>
-        <w:tblBorders>
-          <w:top w:val="single" w:sz="4" w:space="0" w:color="auto"/>
-          <w:left w:val="single" w:sz="4" w:space="0" w:color="auto"/>
-          <w:bottom w:val="single" w:sz="4" w:space="0" w:color="auto"/>
-          <w:right w:val="single" w:sz="4" w:space="0" w:color="auto"/>
-          <w:insideH w:val="single" w:sz="4" w:space="0" w:color="auto"/>
-          <w:insideV w:val="single" w:sz="4" w:space="0" w:color="auto"/>
-        </w:tblBorders>
-        <w:tblCellMar>
-          <w:left w:w="10" w:type="dxa"/>
-          <w:right w:w="10" w:type="dxa"/>
-        </w:tblCellMar>
-        <w:tblLook w:val="04A0" w:firstRow="1" w:lastRow="0" w:firstColumn="1" w:lastColumn="0" w:noHBand="0" w:noVBand="1"/>
-      </w:tblPr>
-      <w:tblGrid>
-        <w:gridCol w:w="3200"/>
-        <w:gridCol w:w="5800"/>
-      </w:tblGrid>
-      <w:tr>
-        <w:trPr>
-          <w:tblHeader/>
-        </w:trPr>
-        <w:tc>
-          <w:tcPr>
-            <w:tcW w:w="3200" w:type="dxa"/>
-            <w:shd w:val="clear" w:color="auto" w:fill="D9D9D9"/>
-            <w:tcMar>
-              <w:top w:w="80" w:type="dxa"/>
-              <w:left w:w="100" w:type="dxa"/>
-              <w:bottom w:w="80" w:type="dxa"/>
-              <w:right w:w="100" w:type="dxa"/>
-            </w:tcMar>
-          </w:tcPr>
-          <w:p>
-            <w:pPr>
-              <w:rPr>
-                <w:rFonts w:ascii="Arial" w:hAnsi="Arial" w:cs="Arial"/>
-                <w:highlight w:val="yellow"/>
-              </w:rPr>
-            </w:pPr>
-            <w:r>
-              <w:rPr>
-                <w:rFonts w:ascii="Arial" w:hAnsi="Arial" w:cs="Arial"/>
-                <w:b/>
-                <w:bCs/>
-                <w:sz w:val="20"/>
-                <w:szCs w:val="20"/>
-                <w:highlight w:val="yellow"/>
-              </w:rPr>
-              <w:t>Arquivo</w:t>
-            </w:r>
-          </w:p>
-        </w:tc>
-        <w:tc>
-          <w:tcPr>
-            <w:tcW w:w="5800" w:type="dxa"/>
-            <w:shd w:val="clear" w:color="auto" w:fill="D9D9D9"/>
-            <w:tcMar>
-              <w:top w:w="80" w:type="dxa"/>
-              <w:left w:w="100" w:type="dxa"/>
-              <w:bottom w:w="80" w:type="dxa"/>
-              <w:right w:w="100" w:type="dxa"/>
-            </w:tcMar>
-          </w:tcPr>
-          <w:p>
-            <w:pPr>
-              <w:rPr>
-                <w:rFonts w:ascii="Arial" w:hAnsi="Arial" w:cs="Arial"/>
-                <w:highlight w:val="yellow"/>
-              </w:rPr>
-            </w:pPr>
-            <w:r>
-              <w:rPr>
-                <w:rFonts w:ascii="Arial" w:hAnsi="Arial" w:cs="Arial"/>
-                <w:b/>
-                <w:bCs/>
-                <w:sz w:val="20"/>
-                <w:szCs w:val="20"/>
-                <w:highlight w:val="yellow"/>
-              </w:rPr>
-              <w:t>Conteúdo</w:t>
-            </w:r>
-          </w:p>
-        </w:tc>
-      </w:tr>
-      <w:tr>
-        <w:tc>
-          <w:tcPr>
-            <w:tcW w:w="3200" w:type="dxa"/>
-            <w:tcMar>
-              <w:top w:w="80" w:type="dxa"/>
-              <w:left w:w="100" w:type="dxa"/>
-              <w:bottom w:w="80" w:type="dxa"/>
-              <w:right w:w="100" w:type="dxa"/>
-            </w:tcMar>
-          </w:tcPr>
-          <w:p>
-            <w:pPr>
-              <w:rPr>
-                <w:rFonts w:ascii="Arial" w:hAnsi="Arial" w:cs="Arial"/>
-                <w:highlight w:val="yellow"/>
-              </w:rPr>
-            </w:pPr>
-            <w:r>
-              <w:rPr>
-                <w:rFonts w:ascii="Arial" w:eastAsia="Courier New" w:hAnsi="Arial" w:cs="Arial"/>
-                <w:sz w:val="18"/>
-                <w:szCs w:val="18"/>
-                <w:highlight w:val="yellow"/>
-              </w:rPr>
-              <w:t>05-guia-teste-iniciante.txt</w:t>
-            </w:r>
-          </w:p>
-        </w:tc>
-        <w:tc>
-          <w:tcPr>
-            <w:tcW w:w="5800" w:type="dxa"/>
-            <w:tcMar>
-              <w:top w:w="80" w:type="dxa"/>
-              <w:left w:w="100" w:type="dxa"/>
-              <w:bottom w:w="80" w:type="dxa"/>
-              <w:right w:w="100" w:type="dxa"/>
-            </w:tcMar>
-          </w:tcPr>
-          <w:p>
-            <w:pPr>
-              <w:rPr>
-                <w:rFonts w:ascii="Arial" w:hAnsi="Arial" w:cs="Arial"/>
-                <w:highlight w:val="yellow"/>
-              </w:rPr>
-            </w:pPr>
-            <w:r>
-              <w:rPr>
-                <w:rFonts w:ascii="Arial" w:hAnsi="Arial" w:cs="Arial"/>
-                <w:sz w:val="20"/>
-                <w:szCs w:val="20"/>
-                <w:highlight w:val="yellow"/>
-              </w:rPr>
-              <w:t>Cópia de trabalho do guia de instalação do ambiente de desenvolvimento (mesmo conteúdo do documento 05, em docs/documentacao/).</w:t>
-            </w:r>
-          </w:p>
-        </w:tc>
-      </w:tr>
-      <w:tr>
-        <w:tc>
-          <w:tcPr>
-            <w:tcW w:w="3200" w:type="dxa"/>
-            <w:tcMar>
-              <w:top w:w="80" w:type="dxa"/>
-              <w:left w:w="100" w:type="dxa"/>
-              <w:bottom w:w="80" w:type="dxa"/>
-              <w:right w:w="100" w:type="dxa"/>
-            </w:tcMar>
-          </w:tcPr>
-          <w:p>
-            <w:pPr>
-              <w:rPr>
-                <w:rFonts w:ascii="Arial" w:hAnsi="Arial" w:cs="Arial"/>
-                <w:highlight w:val="yellow"/>
-              </w:rPr>
-            </w:pPr>
-            <w:r>
-              <w:rPr>
-                <w:rFonts w:ascii="Arial" w:eastAsia="Courier New" w:hAnsi="Arial" w:cs="Arial"/>
-                <w:sz w:val="18"/>
-                <w:szCs w:val="18"/>
-                <w:highlight w:val="yellow"/>
-              </w:rPr>
-              <w:t>06-guia-teste-arduino-real.txt</w:t>
-            </w:r>
-          </w:p>
-        </w:tc>
-        <w:tc>
-          <w:tcPr>
-            <w:tcW w:w="5800" w:type="dxa"/>
-            <w:tcMar>
-              <w:top w:w="80" w:type="dxa"/>
-              <w:left w:w="100" w:type="dxa"/>
-              <w:bottom w:w="80" w:type="dxa"/>
-              <w:right w:w="100" w:type="dxa"/>
-            </w:tcMar>
-          </w:tcPr>
-          <w:p>
-            <w:pPr>
-              <w:rPr>
-                <w:rFonts w:ascii="Arial" w:hAnsi="Arial" w:cs="Arial"/>
-                <w:highlight w:val="yellow"/>
-              </w:rPr>
-            </w:pPr>
-            <w:r>
-              <w:rPr>
-                <w:rFonts w:ascii="Arial" w:hAnsi="Arial" w:cs="Arial"/>
-                <w:sz w:val="20"/>
-                <w:szCs w:val="20"/>
-                <w:highlight w:val="yellow"/>
-              </w:rPr>
-              <w:t>Cópia de trabalho do guia de teste com um ESP32 físico e sensor DHT11 (mesmo conteúdo do documento 06).</w:t>
-            </w:r>
-          </w:p>
-        </w:tc>
-      </w:tr>
-      <w:tr>
-        <w:tc>
-          <w:tcPr>
-            <w:tcW w:w="3200" w:type="dxa"/>
-            <w:tcMar>
-              <w:top w:w="80" w:type="dxa"/>
-              <w:left w:w="100" w:type="dxa"/>
-              <w:bottom w:w="80" w:type="dxa"/>
-              <w:right w:w="100" w:type="dxa"/>
-            </w:tcMar>
-          </w:tcPr>
-          <w:p>
-            <w:pPr>
-              <w:rPr>
-                <w:rFonts w:ascii="Arial" w:hAnsi="Arial" w:cs="Arial"/>
-                <w:highlight w:val="yellow"/>
-              </w:rPr>
-            </w:pPr>
-            <w:r>
-              <w:rPr>
-                <w:rFonts w:ascii="Arial" w:eastAsia="Courier New" w:hAnsi="Arial" w:cs="Arial"/>
-                <w:sz w:val="18"/>
-                <w:szCs w:val="18"/>
-                <w:highlight w:val="yellow"/>
-              </w:rPr>
-              <w:t>Tutorial ESP.txt</w:t>
-            </w:r>
-          </w:p>
-        </w:tc>
-        <w:tc>
-          <w:tcPr>
-            <w:tcW w:w="5800" w:type="dxa"/>
-            <w:tcMar>
-              <w:top w:w="80" w:type="dxa"/>
-              <w:left w:w="100" w:type="dxa"/>
-              <w:bottom w:w="80" w:type="dxa"/>
-              <w:right w:w="100" w:type="dxa"/>
-            </w:tcMar>
-          </w:tcPr>
-          <w:p>
-            <w:pPr>
-              <w:rPr>
-                <w:rFonts w:ascii="Arial" w:hAnsi="Arial" w:cs="Arial"/>
-                <w:highlight w:val="yellow"/>
-              </w:rPr>
-            </w:pPr>
-            <w:r>
-              <w:rPr>
-                <w:rFonts w:ascii="Arial" w:hAnsi="Arial" w:cs="Arial"/>
-                <w:sz w:val="20"/>
-                <w:szCs w:val="20"/>
-                <w:highlight w:val="yellow"/>
-              </w:rPr>
-              <w:t>Anotações rápidas de fiação do DHT11 ao ESP32, tomadas durante a montagem física do protótipo.</w:t>
-            </w:r>
-          </w:p>
-        </w:tc>
-      </w:tr>
-      <w:tr>
-        <w:tc>
-          <w:tcPr>
-            <w:tcW w:w="3200" w:type="dxa"/>
-            <w:tcMar>
-              <w:top w:w="80" w:type="dxa"/>
-              <w:left w:w="100" w:type="dxa"/>
-              <w:bottom w:w="80" w:type="dxa"/>
-              <w:right w:w="100" w:type="dxa"/>
-            </w:tcMar>
-          </w:tcPr>
-          <w:p>
-            <w:pPr>
-              <w:rPr>
-                <w:rFonts w:ascii="Arial" w:hAnsi="Arial" w:cs="Arial"/>
-                <w:highlight w:val="yellow"/>
-              </w:rPr>
-            </w:pPr>
-            <w:r>
-              <w:rPr>
-                <w:rFonts w:ascii="Arial" w:eastAsia="Courier New" w:hAnsi="Arial" w:cs="Arial"/>
-                <w:sz w:val="18"/>
-                <w:szCs w:val="18"/>
-                <w:highlight w:val="yellow"/>
-              </w:rPr>
-              <w:t>Tutorial escola.txt</w:t>
-            </w:r>
-          </w:p>
-        </w:tc>
-        <w:tc>
-          <w:tcPr>
-            <w:tcW w:w="5800" w:type="dxa"/>
-            <w:tcMar>
-              <w:top w:w="80" w:type="dxa"/>
-              <w:left w:w="100" w:type="dxa"/>
-              <w:bottom w:w="80" w:type="dxa"/>
-              <w:right w:w="100" w:type="dxa"/>
-            </w:tcMar>
-          </w:tcPr>
-          <w:p>
-            <w:pPr>
-              <w:rPr>
-                <w:rFonts w:ascii="Arial" w:hAnsi="Arial" w:cs="Arial"/>
-                <w:highlight w:val="yellow"/>
-              </w:rPr>
-            </w:pPr>
-            <w:r>
-              <w:rPr>
-                <w:rFonts w:ascii="Arial" w:hAnsi="Arial" w:cs="Arial"/>
-                <w:sz w:val="20"/>
-                <w:szCs w:val="20"/>
-                <w:highlight w:val="yellow"/>
-              </w:rPr>
-              <w:t>Comandos de terminal (PowerShell, psql) anotados durante as sessões práticas de teste na escola.</w:t>
             </w:r>
           </w:p>
         </w:tc>

</xml_diff>